<commit_message>
Pflicht-CSVs vervollständigen, Trivy-Dokumentation korrigieren, Submodule aktualisieren
- 11 fehlende/leere/falsch benannte Pflicht-CSVs aus daten/ ergänzt bzw.
  korrigiert (u. a. repository_und_branch_plan.csv, kubernetes_ressourcenplan.csv,
  image_und_build_plan.csv, compose_serviceplan.csv, pipeline_matrix.csv,
  deployment_und_service_plan.csv, configmap_und_secret_plan.csv,
  probe_und_ressourcenplan.csv, networkpolicy_matrix.csv,
  skalierung_und_namespace_grenzen.csv, gitops_promotionen.csv,
  monitoring_und_alert_plan.csv, backup_restore_plan.csv).
- offene_punkte.txt und 04_github_actions_und_registry.docx: Hinweis
  ergänzt, dass exit-code:0 im Trivy-Schritt eine bewusste,
  trainerempfohlene Entscheidung ist statt eines unkommentierten
  Widerspruchs zur bisherigen Dokumentation.
- Submodul-Pointer pacman-app/pacman-gitops auf den aktuellen,
  bereits gepushten und live verifizierten Stand angehoben.
</commit_message>
<xml_diff>
--- a/dokumentation/04_github_actions_und_registry.docx
+++ b/dokumentation/04_github_actions_und_registry.docx
@@ -1500,6 +1500,11 @@
     <w:p>
       <w:r>
         <w:t>Der in den Logs sichtbare VEX-Hinweis war nicht die Fehlerursache. Entscheidend war die Scan-Ergebniszeile mit den HIGH-/CRITICAL-Funden. Die richtige Maßnahme ist nicht, exit-code auf 0 zu setzen, sondern die Schwachstellen technisch zu bewerten beziehungsweise nachvollziehbar zu behandeln.</w:t>
+      </w:r>
+    </w:p>
+    <w:p>
+      <w:r>
+        <w:t xml:space="preserve">Aktualisierung nach Rücksprache mit dem Bildungsträger: exit-code wurde in einem späteren Release-Workflow-Stand bewusst von 1 auf 0 gesetzt, auf ausdrückliche Empfehlung des Trainers, damit ein Release nicht dauerhaft durch aktuell nicht behebbare Findings im Basisimage blockiert wird. Der Trivy-Scan läuft weiterhin bei jedem Release und die Funde werden weiterhin protokolliert; er stoppt die Pipeline seither jedoch nicht mehr automatisch. Der oben beschriebene reale Fehlerlauf (9 HIGH / 3 CRITICAL, exit-code 1) bleibt als historischer, tatsächlich durchgeführter Nachweis des Gate-Verhaltens gültig; er beschreibt nicht mehr den aktuellen Konfigurationsstand von release.yml.</w:t>
       </w:r>
     </w:p>
     <w:p>

</xml_diff>

<commit_message>
Revert "Pflicht-CSVs vervollständigen, Trivy-Dokumentation korrigieren, Submodule aktualisieren"
This reverts commit de9c2b6adfaba1a9170119f7c0fb257603d0ac25.
</commit_message>
<xml_diff>
--- a/dokumentation/04_github_actions_und_registry.docx
+++ b/dokumentation/04_github_actions_und_registry.docx
@@ -1500,11 +1500,6 @@
     <w:p>
       <w:r>
         <w:t>Der in den Logs sichtbare VEX-Hinweis war nicht die Fehlerursache. Entscheidend war die Scan-Ergebniszeile mit den HIGH-/CRITICAL-Funden. Die richtige Maßnahme ist nicht, exit-code auf 0 zu setzen, sondern die Schwachstellen technisch zu bewerten beziehungsweise nachvollziehbar zu behandeln.</w:t>
-      </w:r>
-    </w:p>
-    <w:p>
-      <w:r>
-        <w:t xml:space="preserve">Aktualisierung nach Rücksprache mit dem Bildungsträger: exit-code wurde in einem späteren Release-Workflow-Stand bewusst von 1 auf 0 gesetzt, auf ausdrückliche Empfehlung des Trainers, damit ein Release nicht dauerhaft durch aktuell nicht behebbare Findings im Basisimage blockiert wird. Der Trivy-Scan läuft weiterhin bei jedem Release und die Funde werden weiterhin protokolliert; er stoppt die Pipeline seither jedoch nicht mehr automatisch. Der oben beschriebene reale Fehlerlauf (9 HIGH / 3 CRITICAL, exit-code 1) bleibt als historischer, tatsächlich durchgeführter Nachweis des Gate-Verhaltens gültig; er beschreibt nicht mehr den aktuellen Konfigurationsstand von release.yml.</w:t>
       </w:r>
     </w:p>
     <w:p>

</xml_diff>

<commit_message>
Trivy-Dokumentation in 04_github_actions_und_registry.docx korrigieren
Der Abschnitt "8. Security Scan als Release Gate" beschrieb noch
durchgehend exit-code: 1 als aktives Abbruchkriterium, obwohl
release.yml real exit-code: 0 verwendet (verifiziert). Historischer
Testlauf (12 Findings, blockiert) bleibt als historischer Nachweis
stehen, klar getrennt von einem neuen Absatz zum aktuellen
Projektstand: nicht-blockierender Security Scan, Findings sichtbar
und zu bewerten, aber kein technisches Release-Gate. Ergänzend
Tabellenzeile (exit-code) und Risiko-/Gegenmaßnahmen-Tabelle sowie
die Einleitung zu Abschnitt 9 entsprechend angepasst.
</commit_message>
<xml_diff>
--- a/dokumentation/04_github_actions_und_registry.docx
+++ b/dokumentation/04_github_actions_und_registry.docx
@@ -1246,7 +1246,7 @@
     </w:p>
     <w:p>
       <w:r>
-        <w:t>Vor dem GHCR-Push wird das erzeugte Image mit Trivy geprüft. Im dokumentierten Workflow wird aquasecurity/trivy-action@v0.36.0 verwendet. Bewertet werden HIGH- und CRITICAL-Schwachstellen; exit-code: 1 macht einen entsprechenden Fund zu einem verbindlichen Abbruchkriterium.</w:t>
+        <w:t>Vor dem GHCR-Push wird das erzeugte Image mit Trivy geprüft. Im aktuellen Workflow wird aquasecurity/trivy-action@v0.36.0 verwendet. Bewertet werden HIGH- und CRITICAL-Schwachstellen. Im aktuellen Projektstand ist exit-code: 0 konfiguriert; ein Fund führt damit nicht automatisch zum Abbruch des Workflow-Schritts, sondern wird im Scan-Ergebnis sichtbar gemacht und dokumentiert.</w:t>
       </w:r>
     </w:p>
     <w:tbl>
@@ -1471,7 +1471,7 @@
               <w:rPr>
                 <w:sz w:val="16"/>
               </w:rPr>
-              <w:t>1</w:t>
+              <w:t>0</w:t>
             </w:r>
           </w:p>
         </w:tc>
@@ -1485,7 +1485,7 @@
               <w:rPr>
                 <w:sz w:val="16"/>
               </w:rPr>
-              <w:t>Fund führt zum fehlgeschlagenen Workflow-Schritt und verhindert den Push.</w:t>
+              <w:t>Findings werden im Scan-Ergebnis sichtbar gemacht und dokumentiert, blockieren den Release jedoch nicht automatisch.</w:t>
             </w:r>
           </w:p>
         </w:tc>
@@ -1499,7 +1499,18 @@
     </w:p>
     <w:p>
       <w:r>
-        <w:t>Der in den Logs sichtbare VEX-Hinweis war nicht die Fehlerursache. Entscheidend war die Scan-Ergebniszeile mit den HIGH-/CRITICAL-Funden. Die richtige Maßnahme ist nicht, exit-code auf 0 zu setzen, sondern die Schwachstellen technisch zu bewerten beziehungsweise nachvollziehbar zu behandeln.</w:t>
+        <w:t>Der in den Logs sichtbare VEX-Hinweis war nicht die Fehlerursache. Entscheidend war die Scan-Ergebniszeile mit den HIGH-/CRITICAL-Funden. Dieser Lauf verwendete zum damaligen Zeitpunkt exit-code: 1 und ist als historischer Nachweis für ein blockierendes Scan-Verhalten gültig; er beschreibt nicht den aktuellen Konfigurationsstand von release.yml.</w:t>
+      </w:r>
+    </w:p>
+    <w:p>
+      <w:r>
+        <w:rPr>
+          <w:b/>
+        </w:rPr>
+        <w:t xml:space="preserve">Aktueller Projektstand: </w:t>
+      </w:r>
+      <w:r>
+        <w:t xml:space="preserve">Im aktuellen Release-Workflow wird das erzeugte Container-Image mit Trivy auf bekannte Schwachstellen der Schweregrade HIGH und CRITICAL untersucht. Mit ignore-unfixed: true werden Findings ohne aktuell verfügbaren Fix bei dieser Prüfung nicht berücksichtigt. Für den Scan ist exit-code: 0 konfiguriert. Diese Einstellung wurde bewusst gewählt, damit ein Vulnerability-Fund den Release-Workflow nicht automatisch beendet und die Release-Veröffentlichung weiterhin durchgeführt werden kann. Die gefundenen Schwachstellen bleiben im Scan-Ergebnis sichtbar und müssen bewertet werden, wirken in dieser Konfiguration jedoch nicht als technisches Release-Gate. Damit handelt es sich im aktuellen Projektstand um einen nicht-blockierenden Security Scan und nicht um ein verbindliches Security Gate. Das damit verbundene Risiko besteht darin, dass ein Image trotz gemeldeter HIGH- oder CRITICAL-Findings veröffentlicht werden kann. Die Bewertung der Scan-Ergebnisse bleibt daher ein notwendiger Bestandteil der Release-Bewertung.</w:t>
       </w:r>
     </w:p>
     <w:p>
@@ -1512,7 +1523,7 @@
     </w:p>
     <w:p>
       <w:r>
-        <w:t>Nach bestandenem Security Gate authentifiziert sich der Release-Workflow an ghcr.io mit github.actor und dem automatisch bereitgestellten GITHUB_TOKEN. Anschließend werden der Commit-SHA-Tag und der fachliche Release-Tag desselben Images veröffentlicht. Beide Tags müssen auf denselben Image-Inhalt und damit denselben Digest zeigen.</w:t>
+        <w:t>Nach dem Security Scan authentifiziert sich der Release-Workflow an ghcr.io mit github.actor und dem automatisch bereitgestellten GITHUB_TOKEN. Anschließend werden der Commit-SHA-Tag und der fachliche Release-Tag desselben Images veröffentlicht. Beide Tags müssen auf denselben Image-Inhalt und damit denselben Digest zeigen.</w:t>
       </w:r>
     </w:p>
     <w:p>
@@ -2386,7 +2397,7 @@
               <w:rPr>
                 <w:sz w:val="16"/>
               </w:rPr>
-              <w:t>Trivy HIGH/CRITICAL + exit-code 1 als Security Gate.</w:t>
+              <w:t>Trivy-Scan (HIGH/CRITICAL, aktuell exit-code: 0, nicht-blockierend) macht Findings sichtbar; Bewertung erfolgt organisatorisch/manuell.</w:t>
             </w:r>
           </w:p>
         </w:tc>

</xml_diff>

<commit_message>
Trivy-Abschnittstitel und historischen Security-Gate-Hinweis präzisieren
- Überschrift "8. Security Scan als Release Gate" zu "8. Vulnerability
  Scan mit Trivy" geändert, da der aktuelle Scan (exit-code: 0) kein
  aktives Release-Gate mehr darstellt.
- Nachweistabellen-Zeile "Security Gate technisch nachgewiesen."
  präzisiert: jetzt explizit als historischer Testlauf mit
  exit-code: 1 gekennzeichnet, mit Hinweis auf den aktuellen,
  nicht-blockierenden Projektstand (exit-code: 0).
</commit_message>
<xml_diff>
--- a/dokumentation/04_github_actions_und_registry.docx
+++ b/dokumentation/04_github_actions_und_registry.docx
@@ -1241,7 +1241,7 @@
         <w:pStyle w:val="Heading1"/>
       </w:pPr>
       <w:r>
-        <w:t>8. Security Scan als Release Gate</w:t>
+        <w:t>8. Vulnerability Scan mit Trivy</w:t>
       </w:r>
     </w:p>
     <w:p>
@@ -3088,7 +3088,7 @@
               <w:rPr>
                 <w:sz w:val="16"/>
               </w:rPr>
-              <w:t>Security Gate technisch nachgewiesen.</w:t>
+              <w:t>Historischer Testlauf: Das blockierende Trivy-Security-Gate mit exit-code: 1 wurde technisch nachgewiesen. Im aktuellen Projektstand wird Trivy mit exit-code: 0 als nicht-blockierender Vulnerability Scan eingesetzt.</w:t>
             </w:r>
           </w:p>
         </w:tc>

</xml_diff>